<commit_message>
Polished pipeline (up to irr and prr) for poster
</commit_message>
<xml_diff>
--- a/study_1/outputs/model_diagnostics/calibration_table.docx
+++ b/study_1/outputs/model_diagnostics/calibration_table.docx
@@ -9,7 +9,7 @@
         <w:tblLook w:firstRow="1" w:lastRow="0" w:firstColumn="0" w:lastColumn="0" w:noHBand="0" w:noVBand="1"/>
       </w:tblPr>
       <w:tblGrid>
-        <w:gridCol w:w="2062"/>
+        <w:gridCol w:w="1940"/>
         <w:gridCol w:w="778"/>
         <w:gridCol w:w="1573"/>
         <w:gridCol w:w="1573"/>
@@ -292,7 +292,7 @@
                 <w:szCs w:val="22"/>
                 <w:color w:val="000000"/>
               </w:rPr>
-              <w:t xml:space="preserve">[0.00896,0.0428]</w:t>
+              <w:t xml:space="preserve">[0.00612,0.107]</w:t>
             </w:r>
           </w:p>
         </w:tc>
@@ -346,7 +346,7 @@
                 <w:szCs w:val="22"/>
                 <w:color w:val="000000"/>
               </w:rPr>
-              <w:t xml:space="preserve">555</w:t>
+              <w:t xml:space="preserve">473</w:t>
             </w:r>
           </w:p>
         </w:tc>
@@ -400,7 +400,7 @@
                 <w:szCs w:val="22"/>
                 <w:color w:val="000000"/>
               </w:rPr>
-              <w:t xml:space="preserve">0.03021137</w:t>
+              <w:t xml:space="preserve">0.06723267</w:t>
             </w:r>
           </w:p>
         </w:tc>
@@ -454,7 +454,7 @@
                 <w:szCs w:val="22"/>
                 <w:color w:val="000000"/>
               </w:rPr>
-              <w:t xml:space="preserve">0.01981982</w:t>
+              <w:t xml:space="preserve">0.02959831</w:t>
             </w:r>
           </w:p>
         </w:tc>
@@ -514,7 +514,7 @@
                 <w:szCs w:val="22"/>
                 <w:color w:val="000000"/>
               </w:rPr>
-              <w:t xml:space="preserve">(0.0428,0.0654]</w:t>
+              <w:t xml:space="preserve">(0.107,0.169]</w:t>
             </w:r>
           </w:p>
         </w:tc>
@@ -568,7 +568,7 @@
                 <w:szCs w:val="22"/>
                 <w:color w:val="000000"/>
               </w:rPr>
-              <w:t xml:space="preserve">554</w:t>
+              <w:t xml:space="preserve">472</w:t>
             </w:r>
           </w:p>
         </w:tc>
@@ -622,7 +622,7 @@
                 <w:szCs w:val="22"/>
                 <w:color w:val="000000"/>
               </w:rPr>
-              <w:t xml:space="preserve">0.05379272</w:t>
+              <w:t xml:space="preserve">0.13740826</w:t>
             </w:r>
           </w:p>
         </w:tc>
@@ -676,7 +676,7 @@
                 <w:szCs w:val="22"/>
                 <w:color w:val="000000"/>
               </w:rPr>
-              <w:t xml:space="preserve">0.03610108</w:t>
+              <w:t xml:space="preserve">0.09110169</w:t>
             </w:r>
           </w:p>
         </w:tc>
@@ -736,7 +736,7 @@
                 <w:szCs w:val="22"/>
                 <w:color w:val="000000"/>
               </w:rPr>
-              <w:t xml:space="preserve">(0.0654,0.0932]</w:t>
+              <w:t xml:space="preserve">(0.169,0.24]</w:t>
             </w:r>
           </w:p>
         </w:tc>
@@ -790,7 +790,7 @@
                 <w:szCs w:val="22"/>
                 <w:color w:val="000000"/>
               </w:rPr>
-              <w:t xml:space="preserve">554</w:t>
+              <w:t xml:space="preserve">472</w:t>
             </w:r>
           </w:p>
         </w:tc>
@@ -844,7 +844,7 @@
                 <w:szCs w:val="22"/>
                 <w:color w:val="000000"/>
               </w:rPr>
-              <w:t xml:space="preserve">0.07843348</w:t>
+              <w:t xml:space="preserve">0.20326169</w:t>
             </w:r>
           </w:p>
         </w:tc>
@@ -898,7 +898,7 @@
                 <w:szCs w:val="22"/>
                 <w:color w:val="000000"/>
               </w:rPr>
-              <w:t xml:space="preserve">0.06317690</w:t>
+              <w:t xml:space="preserve">0.14618644</w:t>
             </w:r>
           </w:p>
         </w:tc>
@@ -958,7 +958,7 @@
                 <w:szCs w:val="22"/>
                 <w:color w:val="000000"/>
               </w:rPr>
-              <w:t xml:space="preserve">(0.0932,0.125]</w:t>
+              <w:t xml:space="preserve">(0.24,0.325]</w:t>
             </w:r>
           </w:p>
         </w:tc>
@@ -1012,7 +1012,7 @@
                 <w:szCs w:val="22"/>
                 <w:color w:val="000000"/>
               </w:rPr>
-              <w:t xml:space="preserve">554</w:t>
+              <w:t xml:space="preserve">473</w:t>
             </w:r>
           </w:p>
         </w:tc>
@@ -1066,7 +1066,7 @@
                 <w:szCs w:val="22"/>
                 <w:color w:val="000000"/>
               </w:rPr>
-              <w:t xml:space="preserve">0.10810450</w:t>
+              <w:t xml:space="preserve">0.28026252</w:t>
             </w:r>
           </w:p>
         </w:tc>
@@ -1120,7 +1120,7 @@
                 <w:szCs w:val="22"/>
                 <w:color w:val="000000"/>
               </w:rPr>
-              <w:t xml:space="preserve">0.10288809</w:t>
+              <w:t xml:space="preserve">0.27061311</w:t>
             </w:r>
           </w:p>
         </w:tc>
@@ -1180,7 +1180,7 @@
                 <w:szCs w:val="22"/>
                 <w:color w:val="000000"/>
               </w:rPr>
-              <w:t xml:space="preserve">(0.125,0.165]</w:t>
+              <w:t xml:space="preserve">(0.325,0.418]</w:t>
             </w:r>
           </w:p>
         </w:tc>
@@ -1234,7 +1234,7 @@
                 <w:szCs w:val="22"/>
                 <w:color w:val="000000"/>
               </w:rPr>
-              <w:t xml:space="preserve">554</w:t>
+              <w:t xml:space="preserve">473</w:t>
             </w:r>
           </w:p>
         </w:tc>
@@ -1288,7 +1288,7 @@
                 <w:szCs w:val="22"/>
                 <w:color w:val="000000"/>
               </w:rPr>
-              <w:t xml:space="preserve">0.14385050</w:t>
+              <w:t xml:space="preserve">0.36951023</w:t>
             </w:r>
           </w:p>
         </w:tc>
@@ -1342,7 +1342,7 @@
                 <w:szCs w:val="22"/>
                 <w:color w:val="000000"/>
               </w:rPr>
-              <w:t xml:space="preserve">0.15162455</w:t>
+              <w:t xml:space="preserve">0.34249471</w:t>
             </w:r>
           </w:p>
         </w:tc>
@@ -1402,7 +1402,7 @@
                 <w:szCs w:val="22"/>
                 <w:color w:val="000000"/>
               </w:rPr>
-              <w:t xml:space="preserve">(0.165,0.216]</w:t>
+              <w:t xml:space="preserve">(0.418,0.499]</w:t>
             </w:r>
           </w:p>
         </w:tc>
@@ -1456,7 +1456,7 @@
                 <w:szCs w:val="22"/>
                 <w:color w:val="000000"/>
               </w:rPr>
-              <w:t xml:space="preserve">554</w:t>
+              <w:t xml:space="preserve">471</w:t>
             </w:r>
           </w:p>
         </w:tc>
@@ -1510,7 +1510,7 @@
                 <w:szCs w:val="22"/>
                 <w:color w:val="000000"/>
               </w:rPr>
-              <w:t xml:space="preserve">0.19037768</w:t>
+              <w:t xml:space="preserve">0.45793826</w:t>
             </w:r>
           </w:p>
         </w:tc>
@@ -1564,7 +1564,7 @@
                 <w:szCs w:val="22"/>
                 <w:color w:val="000000"/>
               </w:rPr>
-              <w:t xml:space="preserve">0.18231047</w:t>
+              <w:t xml:space="preserve">0.51592357</w:t>
             </w:r>
           </w:p>
         </w:tc>
@@ -1624,7 +1624,7 @@
                 <w:szCs w:val="22"/>
                 <w:color w:val="000000"/>
               </w:rPr>
-              <w:t xml:space="preserve">(0.216,0.278]</w:t>
+              <w:t xml:space="preserve">(0.499,0.591]</w:t>
             </w:r>
           </w:p>
         </w:tc>
@@ -1678,7 +1678,7 @@
                 <w:szCs w:val="22"/>
                 <w:color w:val="000000"/>
               </w:rPr>
-              <w:t xml:space="preserve">554</w:t>
+              <w:t xml:space="preserve">473</w:t>
             </w:r>
           </w:p>
         </w:tc>
@@ -1732,7 +1732,7 @@
                 <w:szCs w:val="22"/>
                 <w:color w:val="000000"/>
               </w:rPr>
-              <w:t xml:space="preserve">0.24473948</w:t>
+              <w:t xml:space="preserve">0.54512278</w:t>
             </w:r>
           </w:p>
         </w:tc>
@@ -1786,7 +1786,7 @@
                 <w:szCs w:val="22"/>
                 <w:color w:val="000000"/>
               </w:rPr>
-              <w:t xml:space="preserve">0.25270758</w:t>
+              <w:t xml:space="preserve">0.56236786</w:t>
             </w:r>
           </w:p>
         </w:tc>
@@ -1846,7 +1846,7 @@
                 <w:szCs w:val="22"/>
                 <w:color w:val="000000"/>
               </w:rPr>
-              <w:t xml:space="preserve">(0.278,0.356]</w:t>
+              <w:t xml:space="preserve">(0.591,0.679]</w:t>
             </w:r>
           </w:p>
         </w:tc>
@@ -1900,7 +1900,7 @@
                 <w:szCs w:val="22"/>
                 <w:color w:val="000000"/>
               </w:rPr>
-              <w:t xml:space="preserve">554</w:t>
+              <w:t xml:space="preserve">471</w:t>
             </w:r>
           </w:p>
         </w:tc>
@@ -1954,7 +1954,7 @@
                 <w:szCs w:val="22"/>
                 <w:color w:val="000000"/>
               </w:rPr>
-              <w:t xml:space="preserve">0.31450466</w:t>
+              <w:t xml:space="preserve">0.63405390</w:t>
             </w:r>
           </w:p>
         </w:tc>
@@ -2008,7 +2008,7 @@
                 <w:szCs w:val="22"/>
                 <w:color w:val="000000"/>
               </w:rPr>
-              <w:t xml:space="preserve">0.31588448</w:t>
+              <w:t xml:space="preserve">0.68577495</w:t>
             </w:r>
           </w:p>
         </w:tc>
@@ -2068,7 +2068,7 @@
                 <w:szCs w:val="22"/>
                 <w:color w:val="000000"/>
               </w:rPr>
-              <w:t xml:space="preserve">(0.356,0.474]</w:t>
+              <w:t xml:space="preserve">(0.679,0.791]</w:t>
             </w:r>
           </w:p>
         </w:tc>
@@ -2122,7 +2122,7 @@
                 <w:szCs w:val="22"/>
                 <w:color w:val="000000"/>
               </w:rPr>
-              <w:t xml:space="preserve">554</w:t>
+              <w:t xml:space="preserve">473</w:t>
             </w:r>
           </w:p>
         </w:tc>
@@ -2176,7 +2176,7 @@
                 <w:szCs w:val="22"/>
                 <w:color w:val="000000"/>
               </w:rPr>
-              <w:t xml:space="preserve">0.41209100</w:t>
+              <w:t xml:space="preserve">0.73289990</w:t>
             </w:r>
           </w:p>
         </w:tc>
@@ -2230,7 +2230,7 @@
                 <w:szCs w:val="22"/>
                 <w:color w:val="000000"/>
               </w:rPr>
-              <w:t xml:space="preserve">0.42238267</w:t>
+              <w:t xml:space="preserve">0.77589852</w:t>
             </w:r>
           </w:p>
         </w:tc>
@@ -2290,7 +2290,7 @@
                 <w:szCs w:val="22"/>
                 <w:color w:val="000000"/>
               </w:rPr>
-              <w:t xml:space="preserve">(0.474,0.791]</w:t>
+              <w:t xml:space="preserve">(0.791,0.957]</w:t>
             </w:r>
           </w:p>
         </w:tc>
@@ -2344,7 +2344,7 @@
                 <w:szCs w:val="22"/>
                 <w:color w:val="000000"/>
               </w:rPr>
-              <w:t xml:space="preserve">554</w:t>
+              <w:t xml:space="preserve">472</w:t>
             </w:r>
           </w:p>
         </w:tc>
@@ -2398,7 +2398,7 @@
                 <w:szCs w:val="22"/>
                 <w:color w:val="000000"/>
               </w:rPr>
-              <w:t xml:space="preserve">0.57595177</w:t>
+              <w:t xml:space="preserve">0.85207183</w:t>
             </w:r>
           </w:p>
         </w:tc>
@@ -2452,7 +2452,7 @@
                 <w:szCs w:val="22"/>
                 <w:color w:val="000000"/>
               </w:rPr>
-              <w:t xml:space="preserve">0.60649819</w:t>
+              <w:t xml:space="preserve">0.87288136</w:t>
             </w:r>
           </w:p>
         </w:tc>

</xml_diff>